<commit_message>
Them de bai Lab1
</commit_message>
<xml_diff>
--- a/slot2/Lab1_Testing_Fundamentals_via_Prompts.docx
+++ b/slot2/Lab1_Testing_Fundamentals_via_Prompts.docx
@@ -5,6 +5,7 @@
     <w:p>
       <w:pPr>
         <w:spacing w:after="80"/>
+        <w:ind w:firstLine="720"/>
         <w:jc w:val="center"/>
       </w:pPr>
       <w:r>
@@ -1642,7 +1643,15 @@
       </w:r>
       <w:proofErr w:type="spellEnd"/>
       <w:r>
-        <w:t xml:space="preserve"> (mini-report) </w:t>
+        <w:t xml:space="preserve"> (</w:t>
+      </w:r>
+      <w:proofErr w:type="gramStart"/>
+      <w:r>
+        <w:t>mini-report</w:t>
+      </w:r>
+      <w:proofErr w:type="gramEnd"/>
+      <w:r>
+        <w:t xml:space="preserve">) </w:t>
       </w:r>
       <w:proofErr w:type="spellStart"/>
       <w:r>
@@ -6211,6 +6220,7 @@
       <w:r>
         <w:t xml:space="preserve"> ISTQB </w:t>
       </w:r>
+      <w:proofErr w:type="gramStart"/>
       <w:r>
         <w:t>….</w:t>
       </w:r>
@@ -6219,6 +6229,7 @@
         <w:t>nếu</w:t>
       </w:r>
       <w:proofErr w:type="spellEnd"/>
+      <w:proofErr w:type="gramEnd"/>
       <w:r>
         <w:t xml:space="preserve"> </w:t>
       </w:r>
@@ -6631,6 +6642,7 @@
         <w:t xml:space="preserve"> tin </w:t>
       </w:r>
       <w:proofErr w:type="spellStart"/>
+      <w:proofErr w:type="gramStart"/>
       <w:r>
         <w:t>cậy</w:t>
       </w:r>
@@ -6638,6 +6650,7 @@
       <w:r>
         <w:t>,…</w:t>
       </w:r>
+      <w:proofErr w:type="gramEnd"/>
     </w:p>
     <w:p>
       <w:pPr>
@@ -20250,7 +20263,15 @@
       </w:r>
       <w:proofErr w:type="spellEnd"/>
       <w:r>
-        <w:t xml:space="preserve"> 2:….</w:t>
+        <w:t xml:space="preserve"> </w:t>
+      </w:r>
+      <w:proofErr w:type="gramStart"/>
+      <w:r>
+        <w:t>2:…</w:t>
+      </w:r>
+      <w:proofErr w:type="gramEnd"/>
+      <w:r>
+        <w:t>.</w:t>
       </w:r>
     </w:p>
     <w:p>

</xml_diff>